<commit_message>
CS1102 Unit 5: Update assignment document with renamed classes (EnrollmentStudent, EnrollmentCourse, EnrollmentSystem) and correct compilation instructions
</commit_message>
<xml_diff>
--- a/CS1102_Programming_1/Unit5_Objects_Classes/Assignment/Unit5_Programming_Assignment.docx
+++ b/CS1102_Programming_1/Unit5_Objects_Classes/Assignment/Unit5_Programming_Assignment.docx
@@ -16,7 +16,7 @@
         <w:t xml:space="preserve">CS 1102 — Unit 5 Programming Assignment</w:t>
       </w:r>
     </w:p>
-    <w:bookmarkStart w:id="9" w:name="Xb9aa9b41f6355effe35ec93bb7a1311dc443208"/>
+    <w:bookmarkStart w:id="9" w:name="X2cc838c494e29a3243a81253ce4dbf569c6b659"/>
     <w:p>
       <w:pPr>
         <w:pStyle w:val="Heading2"/>
@@ -27,7 +27,7 @@
           <w:rFonts w:ascii="Times New Roman" w:hAnsi="Times New Roman"/>
           <w:sz w:val="24"/>
         </w:rPr>
-        <w:t xml:space="preserve">Course Enrollment and Grade Management System</w:t>
+        <w:t xml:space="preserve">EnrollmentCourse Enrollment and Grade Management System</w:t>
       </w:r>
     </w:p>
     <w:p>
@@ -42,7 +42,7 @@
           <w:bCs/>
           <w:sz w:val="24"/>
         </w:rPr>
-        <w:t xml:space="preserve">Student</w:t>
+        <w:t xml:space="preserve">EnrollmentStudent</w:t>
       </w:r>
       <w:r>
         <w:rPr>
@@ -65,7 +65,7 @@
           <w:bCs/>
           <w:sz w:val="24"/>
         </w:rPr>
-        <w:t xml:space="preserve">Course</w:t>
+        <w:t xml:space="preserve">EnrollmentCourse</w:t>
       </w:r>
       <w:r>
         <w:rPr>
@@ -137,7 +137,7 @@
           <w:rFonts w:ascii="Times New Roman" w:hAnsi="Times New Roman"/>
           <w:sz w:val="24"/>
         </w:rPr>
-        <w:t xml:space="preserve">This project implements a Course Enrollment and Grade Management System for a university using three Java classes:</w:t>
+        <w:t xml:space="preserve">This project implements a EnrollmentCourse Enrollment and Grade Management System for a university using three Java classes:</w:t>
       </w:r>
       <w:r>
         <w:rPr>
@@ -152,7 +152,7 @@
           <w:rFonts w:ascii="Times New Roman" w:hAnsi="Times New Roman"/>
           <w:sz w:val="24"/>
         </w:rPr>
-        <w:t xml:space="preserve">Student</w:t>
+        <w:t xml:space="preserve">EnrollmentStudent</w:t>
       </w:r>
       <w:r>
         <w:rPr>
@@ -174,7 +174,7 @@
           <w:rFonts w:ascii="Times New Roman" w:hAnsi="Times New Roman"/>
           <w:sz w:val="24"/>
         </w:rPr>
-        <w:t xml:space="preserve">Course</w:t>
+        <w:t xml:space="preserve">EnrollmentCourse</w:t>
       </w:r>
       <w:r>
         <w:rPr>
@@ -196,7 +196,7 @@
           <w:rFonts w:ascii="Times New Roman" w:hAnsi="Times New Roman"/>
           <w:sz w:val="24"/>
         </w:rPr>
-        <w:t xml:space="preserve">CourseManagement</w:t>
+        <w:t xml:space="preserve">EnrollmentSystem</w:t>
       </w:r>
       <w:r>
         <w:rPr>
@@ -363,7 +363,7 @@
           <w:rFonts w:ascii="Times New Roman" w:hAnsi="Times New Roman"/>
           <w:sz w:val="24"/>
         </w:rPr>
-        <w:t xml:space="preserve">Student</w:t>
+        <w:t xml:space="preserve">EnrollmentStudent</w:t>
       </w:r>
       <w:r>
         <w:rPr>
@@ -392,7 +392,7 @@
           <w:rFonts w:ascii="Times New Roman" w:hAnsi="Times New Roman"/>
           <w:sz w:val="24"/>
         </w:rPr>
-        <w:t xml:space="preserve">Course</w:t>
+        <w:t xml:space="preserve">EnrollmentCourse</w:t>
       </w:r>
       <w:r>
         <w:rPr>
@@ -633,66 +633,7 @@
           <w:rFonts w:ascii="Times New Roman" w:hAnsi="Times New Roman"/>
           <w:sz w:val="24"/>
         </w:rPr>
-        <w:t xml:space="preserve">All three files in the same directory:</w:t>
-      </w:r>
-      <w:r>
-        <w:rPr>
-          <w:rFonts w:ascii="Times New Roman" w:hAnsi="Times New Roman"/>
-          <w:sz w:val="24"/>
-        </w:rPr>
-        <w:t xml:space="preserve"> </w:t>
-      </w:r>
-      <w:r>
-        <w:rPr>
-          <w:rStyle w:val="VerbatimChar"/>
-          <w:rFonts w:ascii="Times New Roman" w:hAnsi="Times New Roman"/>
-          <w:sz w:val="24"/>
-        </w:rPr>
-        <w:t xml:space="preserve">Student.java</w:t>
-      </w:r>
-      <w:r>
-        <w:rPr>
-          <w:rFonts w:ascii="Times New Roman" w:hAnsi="Times New Roman"/>
-          <w:sz w:val="24"/>
-        </w:rPr>
-        <w:t xml:space="preserve">,</w:t>
-      </w:r>
-      <w:r>
-        <w:rPr>
-          <w:rFonts w:ascii="Times New Roman" w:hAnsi="Times New Roman"/>
-          <w:sz w:val="24"/>
-        </w:rPr>
-        <w:t xml:space="preserve"> </w:t>
-      </w:r>
-      <w:r>
-        <w:rPr>
-          <w:rStyle w:val="VerbatimChar"/>
-          <w:rFonts w:ascii="Times New Roman" w:hAnsi="Times New Roman"/>
-          <w:sz w:val="24"/>
-        </w:rPr>
-        <w:t xml:space="preserve">Course.java</w:t>
-      </w:r>
-      <w:r>
-        <w:rPr>
-          <w:rFonts w:ascii="Times New Roman" w:hAnsi="Times New Roman"/>
-          <w:sz w:val="24"/>
-        </w:rPr>
-        <w:t xml:space="preserve">,</w:t>
-      </w:r>
-      <w:r>
-        <w:rPr>
-          <w:rFonts w:ascii="Times New Roman" w:hAnsi="Times New Roman"/>
-          <w:sz w:val="24"/>
-        </w:rPr>
-        <w:t xml:space="preserve"> </w:t>
-      </w:r>
-      <w:r>
-        <w:rPr>
-          <w:rStyle w:val="VerbatimChar"/>
-          <w:rFonts w:ascii="Times New Roman" w:hAnsi="Times New Roman"/>
-          <w:sz w:val="24"/>
-        </w:rPr>
-        <w:t xml:space="preserve">CourseManagement.java</w:t>
+        <w:t xml:space="preserve">All three files: EnrollmentStudent.java, EnrollmentCourse.java, EnrollmentSystem.java</w:t>
       </w:r>
     </w:p>
     <w:bookmarkEnd w:id="11"/>
@@ -734,7 +675,7 @@
           <w:rFonts w:ascii="Times New Roman" w:hAnsi="Times New Roman"/>
           <w:sz w:val="24"/>
         </w:rPr>
-        <w:t xml:space="preserve">javac Student.java Course.java CourseManagement.java</w:t>
+        <w:t xml:space="preserve">javac CS1102_Programming_1/Unit5_Objects_Classes/Assignment/*.java</w:t>
       </w:r>
     </w:p>
     <w:bookmarkEnd w:id="12"/>
@@ -763,7 +704,7 @@
           <w:rFonts w:ascii="Times New Roman" w:hAnsi="Times New Roman"/>
           <w:sz w:val="24"/>
         </w:rPr>
-        <w:t xml:space="preserve">java CourseManagement</w:t>
+        <w:t xml:space="preserve">java -cp . CS1102_Programming_1.Unit5_Objects_Classes.Assignment.EnrollmentSystem</w:t>
       </w:r>
     </w:p>
     <w:bookmarkEnd w:id="13"/>
@@ -1556,7 +1497,7 @@
     </w:p>
     <w:bookmarkEnd w:id="14"/>
     <w:bookmarkEnd w:id="15"/>
-    <w:bookmarkStart w:id="22" w:name="student-class-documentation"/>
+    <w:bookmarkStart w:id="22" w:name="enrollmentstudent-class-documentation"/>
     <w:p>
       <w:pPr>
         <w:pStyle w:val="Heading2"/>
@@ -1567,7 +1508,7 @@
           <w:rFonts w:ascii="Times New Roman" w:hAnsi="Times New Roman"/>
           <w:sz w:val="24"/>
         </w:rPr>
-        <w:t xml:space="preserve">3. Student Class — Documentation</w:t>
+        <w:t xml:space="preserve">3. EnrollmentStudent Class — Documentation</w:t>
       </w:r>
     </w:p>
     <w:bookmarkStart w:id="16" w:name="purpose"/>
@@ -1609,7 +1550,7 @@
           <w:rFonts w:ascii="Times New Roman" w:hAnsi="Times New Roman"/>
           <w:sz w:val="24"/>
         </w:rPr>
-        <w:t xml:space="preserve">Student</w:t>
+        <w:t xml:space="preserve">EnrollmentStudent</w:t>
       </w:r>
       <w:r>
         <w:rPr>
@@ -1727,7 +1668,7 @@
               <w:pStyle w:val="Compact"/>
             </w:pPr>
             <w:r>
-              <w:t xml:space="preserve">Student’s full name</w:t>
+              <w:t xml:space="preserve">EnrollmentStudent’s full name</w:t>
             </w:r>
           </w:p>
         </w:tc>
@@ -1798,7 +1739,7 @@
               <w:rPr>
                 <w:rStyle w:val="VerbatimChar"/>
               </w:rPr>
-              <w:t xml:space="preserve">ArrayList&lt;Course&gt;</w:t>
+              <w:t xml:space="preserve">ArrayList&lt;EnrollmentCourse&gt;</w:t>
             </w:r>
           </w:p>
         </w:tc>
@@ -1968,7 +1909,7 @@
           <w:rFonts w:ascii="Times New Roman" w:hAnsi="Times New Roman"/>
           <w:sz w:val="24"/>
         </w:rPr>
-        <w:t xml:space="preserve">Student</w:t>
+        <w:t xml:space="preserve">EnrollmentStudent</w:t>
       </w:r>
       <w:r>
         <w:rPr>
@@ -2274,7 +2215,7 @@
           <w:rFonts w:ascii="Times New Roman" w:hAnsi="Times New Roman"/>
           <w:sz w:val="24"/>
         </w:rPr>
-        <w:t xml:space="preserve">Course</w:t>
+        <w:t xml:space="preserve">EnrollmentCourse</w:t>
       </w:r>
       <w:r>
         <w:rPr>
@@ -2755,7 +2696,7 @@
           <w:bCs/>
           <w:sz w:val="24"/>
         </w:rPr>
-        <w:t xml:space="preserve">enrollCourse(Course course)</w:t>
+        <w:t xml:space="preserve">enrollCourse(EnrollmentCourse course)</w:t>
       </w:r>
       <w:r>
         <w:rPr>
@@ -2807,7 +2748,7 @@
           <w:bCs/>
           <w:sz w:val="24"/>
         </w:rPr>
-        <w:t xml:space="preserve">assignGrade(Course course, double grade)</w:t>
+        <w:t xml:space="preserve">assignGrade(EnrollmentCourse course, double grade)</w:t>
       </w:r>
       <w:r>
         <w:rPr>
@@ -2837,7 +2778,7 @@
           <w:bCs/>
           <w:sz w:val="24"/>
         </w:rPr>
-        <w:t xml:space="preserve">isEnrolledIn(Course course)</w:t>
+        <w:t xml:space="preserve">isEnrolledIn(EnrollmentCourse course)</w:t>
       </w:r>
       <w:r>
         <w:rPr>
@@ -2899,7 +2840,7 @@
     </w:p>
     <w:bookmarkEnd w:id="21"/>
     <w:bookmarkEnd w:id="22"/>
-    <w:bookmarkStart w:id="28" w:name="course-class-documentation"/>
+    <w:bookmarkStart w:id="28" w:name="enrollmentcourse-class-documentation"/>
     <w:p>
       <w:pPr>
         <w:pStyle w:val="Heading2"/>
@@ -2910,7 +2851,7 @@
           <w:rFonts w:ascii="Times New Roman" w:hAnsi="Times New Roman"/>
           <w:sz w:val="24"/>
         </w:rPr>
-        <w:t xml:space="preserve">4. Course Class — Documentation</w:t>
+        <w:t xml:space="preserve">4. EnrollmentCourse Class — Documentation</w:t>
       </w:r>
     </w:p>
     <w:bookmarkStart w:id="23" w:name="purpose-1"/>
@@ -3362,7 +3303,7 @@
           <w:rFonts w:ascii="Times New Roman" w:hAnsi="Times New Roman"/>
           <w:sz w:val="24"/>
         </w:rPr>
-        <w:t xml:space="preserve">Course</w:t>
+        <w:t xml:space="preserve">EnrollmentCourse</w:t>
       </w:r>
       <w:r>
         <w:rPr>
@@ -3952,7 +3893,7 @@
           <w:rFonts w:ascii="Times New Roman" w:hAnsi="Times New Roman"/>
           <w:sz w:val="24"/>
         </w:rPr>
-        <w:t xml:space="preserve">CourseManagement.enrollStudent()</w:t>
+        <w:t xml:space="preserve">EnrollmentSystem.enrollStudent()</w:t>
       </w:r>
       <w:r>
         <w:rPr>
@@ -4079,7 +4020,7 @@
           <w:rFonts w:ascii="Times New Roman" w:hAnsi="Times New Roman"/>
           <w:sz w:val="24"/>
         </w:rPr>
-        <w:t xml:space="preserve">Course.getTotalEnrolledStudents()</w:t>
+        <w:t xml:space="preserve">EnrollmentCourse.getTotalEnrolledStudents()</w:t>
       </w:r>
       <w:r>
         <w:rPr>
@@ -4105,7 +4046,7 @@
     </w:p>
     <w:bookmarkEnd w:id="27"/>
     <w:bookmarkEnd w:id="28"/>
-    <w:bookmarkStart w:id="33" w:name="coursemanagement-class-documentation"/>
+    <w:bookmarkStart w:id="33" w:name="enrollmentsystem-class-documentation"/>
     <w:p>
       <w:pPr>
         <w:pStyle w:val="Heading2"/>
@@ -4116,7 +4057,7 @@
           <w:rFonts w:ascii="Times New Roman" w:hAnsi="Times New Roman"/>
           <w:sz w:val="24"/>
         </w:rPr>
-        <w:t xml:space="preserve">5. CourseManagement Class — Documentation</w:t>
+        <w:t xml:space="preserve">5. EnrollmentSystem Class — Documentation</w:t>
       </w:r>
     </w:p>
     <w:bookmarkStart w:id="29" w:name="purpose-2"/>
@@ -4249,7 +4190,7 @@
           <w:rFonts w:ascii="Times New Roman" w:hAnsi="Times New Roman"/>
           <w:sz w:val="24"/>
         </w:rPr>
-        <w:t xml:space="preserve">Course</w:t>
+        <w:t xml:space="preserve">EnrollmentCourse</w:t>
       </w:r>
       <w:r>
         <w:rPr>
@@ -4376,7 +4317,7 @@
           <w:rFonts w:ascii="Times New Roman" w:hAnsi="Times New Roman"/>
           <w:sz w:val="24"/>
         </w:rPr>
-        <w:t xml:space="preserve">Student</w:t>
+        <w:t xml:space="preserve">EnrollmentStudent</w:t>
       </w:r>
       <w:r>
         <w:rPr>
@@ -4600,7 +4541,7 @@
           <w:rFonts w:ascii="Times New Roman" w:hAnsi="Times New Roman"/>
           <w:sz w:val="24"/>
         </w:rPr>
-        <w:t xml:space="preserve">Course</w:t>
+        <w:t xml:space="preserve">EnrollmentCourse</w:t>
       </w:r>
       <w:r>
         <w:rPr>
@@ -4746,7 +4687,7 @@
           <w:rFonts w:ascii="Times New Roman" w:hAnsi="Times New Roman"/>
           <w:sz w:val="24"/>
         </w:rPr>
-        <w:t xml:space="preserve">Student</w:t>
+        <w:t xml:space="preserve">EnrollmentStudent</w:t>
       </w:r>
       <w:r>
         <w:rPr>
@@ -4805,7 +4746,7 @@
           <w:bCs/>
           <w:sz w:val="24"/>
         </w:rPr>
-        <w:t xml:space="preserve">enrollStudent(Student student, Course course)</w:t>
+        <w:t xml:space="preserve">enrollStudent(EnrollmentStudent student, EnrollmentCourse course)</w:t>
       </w:r>
       <w:r>
         <w:rPr>
@@ -4885,7 +4826,7 @@
           <w:rFonts w:ascii="Times New Roman" w:hAnsi="Times New Roman"/>
           <w:sz w:val="24"/>
         </w:rPr>
-        <w:t xml:space="preserve">CourseManagement</w:t>
+        <w:t xml:space="preserve">EnrollmentSystem</w:t>
       </w:r>
       <w:r>
         <w:rPr>
@@ -4914,7 +4855,7 @@
           <w:rFonts w:ascii="Times New Roman" w:hAnsi="Times New Roman"/>
           <w:sz w:val="24"/>
         </w:rPr>
-        <w:t xml:space="preserve">Student</w:t>
+        <w:t xml:space="preserve">EnrollmentStudent</w:t>
       </w:r>
       <w:r>
         <w:rPr>
@@ -4943,7 +4884,7 @@
           <w:rFonts w:ascii="Times New Roman" w:hAnsi="Times New Roman"/>
           <w:sz w:val="24"/>
         </w:rPr>
-        <w:t xml:space="preserve">Course</w:t>
+        <w:t xml:space="preserve">EnrollmentCourse</w:t>
       </w:r>
       <w:r>
         <w:rPr>
@@ -4973,7 +4914,7 @@
           <w:bCs/>
           <w:sz w:val="24"/>
         </w:rPr>
-        <w:t xml:space="preserve">assignGrade(Student student, Course course, double grade)</w:t>
+        <w:t xml:space="preserve">assignGrade(EnrollmentStudent student, EnrollmentCourse course, double grade)</w:t>
       </w:r>
       <w:r>
         <w:rPr>
@@ -5025,7 +4966,7 @@
           <w:bCs/>
           <w:sz w:val="24"/>
         </w:rPr>
-        <w:t xml:space="preserve">calculateOverallGrade(Student student)</w:t>
+        <w:t xml:space="preserve">calculateOverallGrade(EnrollmentStudent student)</w:t>
       </w:r>
       <w:r>
         <w:rPr>
@@ -5082,7 +5023,7 @@
           <w:rFonts w:ascii="Times New Roman" w:hAnsi="Times New Roman"/>
           <w:sz w:val="24"/>
         </w:rPr>
-        <w:t xml:space="preserve">CourseManagement</w:t>
+        <w:t xml:space="preserve">EnrollmentSystem</w:t>
       </w:r>
       <w:r>
         <w:rPr>
@@ -5148,7 +5089,7 @@
           <w:rFonts w:ascii="Times New Roman" w:hAnsi="Times New Roman"/>
           <w:sz w:val="24"/>
         </w:rPr>
-        <w:t xml:space="preserve">Course</w:t>
+        <w:t xml:space="preserve">EnrollmentCourse</w:t>
       </w:r>
       <w:r>
         <w:rPr>
@@ -5210,7 +5151,7 @@
         <w:t xml:space="preserve">6. Full Program Code</w:t>
       </w:r>
     </w:p>
-    <w:bookmarkStart w:id="34" w:name="student.java"/>
+    <w:bookmarkStart w:id="34" w:name="enrollmentstudent.java"/>
     <w:p>
       <w:pPr>
         <w:pStyle w:val="Heading3"/>
@@ -5221,7 +5162,7 @@
           <w:rFonts w:ascii="Times New Roman" w:hAnsi="Times New Roman"/>
           <w:sz w:val="24"/>
         </w:rPr>
-        <w:t xml:space="preserve">Student.java</w:t>
+        <w:t xml:space="preserve">EnrollmentStudent.java</w:t>
       </w:r>
     </w:p>
     <w:p>
@@ -5415,7 +5356,7 @@
           <w:rFonts w:ascii="Times New Roman" w:hAnsi="Times New Roman"/>
           <w:sz w:val="24"/>
         </w:rPr>
-        <w:t xml:space="preserve"> Student</w:t>
+        <w:t xml:space="preserve"> EnrollmentStudent</w:t>
       </w:r>
       <w:r>
         <w:rPr>
@@ -5532,7 +5473,7 @@
           <w:rFonts w:ascii="Times New Roman" w:hAnsi="Times New Roman"/>
           <w:sz w:val="24"/>
         </w:rPr>
-        <w:t xml:space="preserve"> Student </w:t>
+        <w:t xml:space="preserve"> EnrollmentStudent </w:t>
       </w:r>
       <w:r>
         <w:rPr>
@@ -5712,7 +5653,7 @@
           <w:rFonts w:ascii="Times New Roman" w:hAnsi="Times New Roman"/>
           <w:sz w:val="24"/>
         </w:rPr>
-        <w:t xml:space="preserve">Course</w:t>
+        <w:t xml:space="preserve">EnrollmentCourse</w:t>
       </w:r>
       <w:r>
         <w:rPr>
@@ -5885,7 +5826,7 @@
           <w:rFonts w:ascii="Times New Roman" w:hAnsi="Times New Roman"/>
           <w:sz w:val="24"/>
         </w:rPr>
-        <w:t xml:space="preserve">Student</w:t>
+        <w:t xml:space="preserve">EnrollmentStudent</w:t>
       </w:r>
       <w:r>
         <w:rPr>
@@ -6659,7 +6600,7 @@
           <w:rFonts w:ascii="Times New Roman" w:hAnsi="Times New Roman"/>
           <w:sz w:val="24"/>
         </w:rPr>
-        <w:t xml:space="preserve">Course</w:t>
+        <w:t xml:space="preserve">EnrollmentCourse</w:t>
       </w:r>
       <w:r>
         <w:rPr>
@@ -7671,7 +7612,7 @@
           <w:rFonts w:ascii="Times New Roman" w:hAnsi="Times New Roman"/>
           <w:sz w:val="24"/>
         </w:rPr>
-        <w:t xml:space="preserve">Course course</w:t>
+        <w:t xml:space="preserve">EnrollmentCourse course</w:t>
       </w:r>
       <w:r>
         <w:rPr>
@@ -7954,7 +7895,7 @@
           <w:rFonts w:ascii="Times New Roman" w:hAnsi="Times New Roman"/>
           <w:sz w:val="24"/>
         </w:rPr>
-        <w:t xml:space="preserve">Course course</w:t>
+        <w:t xml:space="preserve">EnrollmentCourse course</w:t>
       </w:r>
       <w:r>
         <w:rPr>
@@ -8412,7 +8353,7 @@
           <w:rFonts w:ascii="Times New Roman" w:hAnsi="Times New Roman"/>
           <w:sz w:val="24"/>
         </w:rPr>
-        <w:t xml:space="preserve">Course course</w:t>
+        <w:t xml:space="preserve">EnrollmentCourse course</w:t>
       </w:r>
       <w:r>
         <w:rPr>
@@ -8678,7 +8619,7 @@
           <w:rFonts w:ascii="Times New Roman" w:hAnsi="Times New Roman"/>
           <w:sz w:val="24"/>
         </w:rPr>
-        <w:t xml:space="preserve">"Student[ID="</w:t>
+        <w:t xml:space="preserve">"EnrollmentStudent[ID="</w:t>
       </w:r>
       <w:r>
         <w:rPr>
@@ -8911,7 +8852,7 @@
       </w:r>
     </w:p>
     <w:bookmarkEnd w:id="34"/>
-    <w:bookmarkStart w:id="35" w:name="course.java"/>
+    <w:bookmarkStart w:id="35" w:name="enrollmentcourse.java"/>
     <w:p>
       <w:pPr>
         <w:pStyle w:val="Heading3"/>
@@ -8922,7 +8863,7 @@
           <w:rFonts w:ascii="Times New Roman" w:hAnsi="Times New Roman"/>
           <w:sz w:val="24"/>
         </w:rPr>
-        <w:t xml:space="preserve">Course.java</w:t>
+        <w:t xml:space="preserve">EnrollmentCourse.java</w:t>
       </w:r>
     </w:p>
     <w:p>
@@ -8967,7 +8908,7 @@
           <w:rFonts w:ascii="Times New Roman" w:hAnsi="Times New Roman"/>
           <w:sz w:val="24"/>
         </w:rPr>
-        <w:t xml:space="preserve"> Course</w:t>
+        <w:t xml:space="preserve"> EnrollmentCourse</w:t>
       </w:r>
       <w:r>
         <w:rPr>
@@ -9061,7 +9002,7 @@
           <w:rFonts w:ascii="Times New Roman" w:hAnsi="Times New Roman"/>
           <w:sz w:val="24"/>
         </w:rPr>
-        <w:t xml:space="preserve"> total enrollments across all Course instances</w:t>
+        <w:t xml:space="preserve"> total enrollments across all EnrollmentCourse instances</w:t>
       </w:r>
       <w:r>
         <w:rPr>
@@ -9131,7 +9072,7 @@
           <w:rFonts w:ascii="Times New Roman" w:hAnsi="Times New Roman"/>
           <w:sz w:val="24"/>
         </w:rPr>
-        <w:t xml:space="preserve"> Course </w:t>
+        <w:t xml:space="preserve"> EnrollmentCourse </w:t>
       </w:r>
       <w:r>
         <w:rPr>
@@ -9396,7 +9337,7 @@
           <w:rFonts w:ascii="Times New Roman" w:hAnsi="Times New Roman"/>
           <w:sz w:val="24"/>
         </w:rPr>
-        <w:t xml:space="preserve">// Static variable — ONE copy shared across ALL Course instances</w:t>
+        <w:t xml:space="preserve">// Static variable — ONE copy shared across ALL EnrollmentCourse instances</w:t>
       </w:r>
       <w:r>
         <w:rPr>
@@ -9537,7 +9478,7 @@
           <w:rFonts w:ascii="Times New Roman" w:hAnsi="Times New Roman"/>
           <w:sz w:val="24"/>
         </w:rPr>
-        <w:t xml:space="preserve">Course</w:t>
+        <w:t xml:space="preserve">EnrollmentCourse</w:t>
       </w:r>
       <w:r>
         <w:rPr>
@@ -11485,7 +11426,7 @@
       </w:r>
     </w:p>
     <w:bookmarkEnd w:id="35"/>
-    <w:bookmarkStart w:id="36" w:name="coursemanagement.java"/>
+    <w:bookmarkStart w:id="36" w:name="enrollmentsystem.java"/>
     <w:p>
       <w:pPr>
         <w:pStyle w:val="Heading3"/>
@@ -11496,7 +11437,7 @@
           <w:rFonts w:ascii="Times New Roman" w:hAnsi="Times New Roman"/>
           <w:sz w:val="24"/>
         </w:rPr>
-        <w:t xml:space="preserve">CourseManagement.java</w:t>
+        <w:t xml:space="preserve">EnrollmentSystem.java</w:t>
       </w:r>
     </w:p>
     <w:p>
@@ -11690,7 +11631,7 @@
           <w:rFonts w:ascii="Times New Roman" w:hAnsi="Times New Roman"/>
           <w:sz w:val="24"/>
         </w:rPr>
-        <w:t xml:space="preserve"> CourseManagement</w:t>
+        <w:t xml:space="preserve"> EnrollmentSystem</w:t>
       </w:r>
       <w:r>
         <w:rPr>
@@ -11909,7 +11850,7 @@
           <w:rFonts w:ascii="Times New Roman" w:hAnsi="Times New Roman"/>
           <w:sz w:val="24"/>
         </w:rPr>
-        <w:t xml:space="preserve"> CourseManagement </w:t>
+        <w:t xml:space="preserve"> EnrollmentSystem </w:t>
       </w:r>
       <w:r>
         <w:rPr>
@@ -12018,7 +11959,7 @@
           <w:rFonts w:ascii="Times New Roman" w:hAnsi="Times New Roman"/>
           <w:sz w:val="24"/>
         </w:rPr>
-        <w:t xml:space="preserve">Course</w:t>
+        <w:t xml:space="preserve">EnrollmentCourse</w:t>
       </w:r>
       <w:r>
         <w:rPr>
@@ -12153,7 +12094,7 @@
           <w:rFonts w:ascii="Times New Roman" w:hAnsi="Times New Roman"/>
           <w:sz w:val="24"/>
         </w:rPr>
-        <w:t xml:space="preserve">Student</w:t>
+        <w:t xml:space="preserve">EnrollmentStudent</w:t>
       </w:r>
       <w:r>
         <w:rPr>
@@ -12477,7 +12418,7 @@
           <w:rFonts w:ascii="Times New Roman" w:hAnsi="Times New Roman"/>
           <w:sz w:val="24"/>
         </w:rPr>
-        <w:t xml:space="preserve">Course c </w:t>
+        <w:t xml:space="preserve">EnrollmentCourse c </w:t>
       </w:r>
       <w:r>
         <w:rPr>
@@ -12707,7 +12648,7 @@
           <w:rFonts w:ascii="Times New Roman" w:hAnsi="Times New Roman"/>
           <w:sz w:val="24"/>
         </w:rPr>
-        <w:t xml:space="preserve">"Error: Course code '"</w:t>
+        <w:t xml:space="preserve">"Error: EnrollmentCourse code '"</w:t>
       </w:r>
       <w:r>
         <w:rPr>
@@ -12903,7 +12844,7 @@
           <w:rFonts w:ascii="Times New Roman" w:hAnsi="Times New Roman"/>
           <w:sz w:val="24"/>
         </w:rPr>
-        <w:t xml:space="preserve">Course</w:t>
+        <w:t xml:space="preserve">EnrollmentCourse</w:t>
       </w:r>
       <w:r>
         <w:rPr>
@@ -13030,7 +12971,7 @@
           <w:rFonts w:ascii="Times New Roman" w:hAnsi="Times New Roman"/>
           <w:sz w:val="24"/>
         </w:rPr>
-        <w:t xml:space="preserve">"Course added: "</w:t>
+        <w:t xml:space="preserve">"EnrollmentCourse added: "</w:t>
       </w:r>
       <w:r>
         <w:rPr>
@@ -13401,7 +13342,7 @@
           <w:rFonts w:ascii="Times New Roman" w:hAnsi="Times New Roman"/>
           <w:sz w:val="24"/>
         </w:rPr>
-        <w:t xml:space="preserve">Student s </w:t>
+        <w:t xml:space="preserve">EnrollmentStudent s </w:t>
       </w:r>
       <w:r>
         <w:rPr>
@@ -13631,7 +13572,7 @@
           <w:rFonts w:ascii="Times New Roman" w:hAnsi="Times New Roman"/>
           <w:sz w:val="24"/>
         </w:rPr>
-        <w:t xml:space="preserve">"Error: Student ID "</w:t>
+        <w:t xml:space="preserve">"Error: EnrollmentStudent ID "</w:t>
       </w:r>
       <w:r>
         <w:rPr>
@@ -13827,7 +13768,7 @@
           <w:rFonts w:ascii="Times New Roman" w:hAnsi="Times New Roman"/>
           <w:sz w:val="24"/>
         </w:rPr>
-        <w:t xml:space="preserve">Student</w:t>
+        <w:t xml:space="preserve">EnrollmentStudent</w:t>
       </w:r>
       <w:r>
         <w:rPr>
@@ -13938,7 +13879,7 @@
           <w:rFonts w:ascii="Times New Roman" w:hAnsi="Times New Roman"/>
           <w:sz w:val="24"/>
         </w:rPr>
-        <w:t xml:space="preserve">"Student added: "</w:t>
+        <w:t xml:space="preserve">"EnrollmentStudent added: "</w:t>
       </w:r>
       <w:r>
         <w:rPr>
@@ -14111,7 +14052,7 @@
           <w:rFonts w:ascii="Times New Roman" w:hAnsi="Times New Roman"/>
           <w:sz w:val="24"/>
         </w:rPr>
-        <w:t xml:space="preserve">// Enroll a student in a course — delegates to Student and Course instance methods</w:t>
+        <w:t xml:space="preserve">// Enroll a student in a course — delegates to EnrollmentStudent and EnrollmentCourse instance methods</w:t>
       </w:r>
       <w:r>
         <w:rPr>
@@ -14198,7 +14139,7 @@
           <w:rFonts w:ascii="Times New Roman" w:hAnsi="Times New Roman"/>
           <w:sz w:val="24"/>
         </w:rPr>
-        <w:t xml:space="preserve">Student student</w:t>
+        <w:t xml:space="preserve">EnrollmentStudent student</w:t>
       </w:r>
       <w:r>
         <w:rPr>
@@ -14214,7 +14155,7 @@
           <w:rFonts w:ascii="Times New Roman" w:hAnsi="Times New Roman"/>
           <w:sz w:val="24"/>
         </w:rPr>
-        <w:t xml:space="preserve"> Course course</w:t>
+        <w:t xml:space="preserve"> EnrollmentCourse course</w:t>
       </w:r>
       <w:r>
         <w:rPr>
@@ -15341,7 +15282,7 @@
           <w:rFonts w:ascii="Times New Roman" w:hAnsi="Times New Roman"/>
           <w:sz w:val="24"/>
         </w:rPr>
-        <w:t xml:space="preserve">// Assign a grade — delegates to Student instance method</w:t>
+        <w:t xml:space="preserve">// Assign a grade — delegates to EnrollmentStudent instance method</w:t>
       </w:r>
       <w:r>
         <w:rPr>
@@ -15428,7 +15369,7 @@
           <w:rFonts w:ascii="Times New Roman" w:hAnsi="Times New Roman"/>
           <w:sz w:val="24"/>
         </w:rPr>
-        <w:t xml:space="preserve">Student student</w:t>
+        <w:t xml:space="preserve">EnrollmentStudent student</w:t>
       </w:r>
       <w:r>
         <w:rPr>
@@ -15444,7 +15385,7 @@
           <w:rFonts w:ascii="Times New Roman" w:hAnsi="Times New Roman"/>
           <w:sz w:val="24"/>
         </w:rPr>
-        <w:t xml:space="preserve"> Course course</w:t>
+        <w:t xml:space="preserve"> EnrollmentCourse course</w:t>
       </w:r>
       <w:r>
         <w:rPr>
@@ -16620,7 +16561,7 @@
           <w:rFonts w:ascii="Times New Roman" w:hAnsi="Times New Roman"/>
           <w:sz w:val="24"/>
         </w:rPr>
-        <w:t xml:space="preserve">Student student</w:t>
+        <w:t xml:space="preserve">EnrollmentStudent student</w:t>
       </w:r>
       <w:r>
         <w:rPr>
@@ -18753,7 +18694,7 @@
           <w:rFonts w:ascii="Times New Roman" w:hAnsi="Times New Roman"/>
           <w:sz w:val="24"/>
         </w:rPr>
-        <w:t xml:space="preserve"> Course </w:t>
+        <w:t xml:space="preserve"> EnrollmentCourse </w:t>
       </w:r>
       <w:r>
         <w:rPr>
@@ -18856,7 +18797,7 @@
           <w:rFonts w:ascii="Times New Roman" w:hAnsi="Times New Roman"/>
           <w:sz w:val="24"/>
         </w:rPr>
-        <w:t xml:space="preserve">Course c </w:t>
+        <w:t xml:space="preserve">EnrollmentCourse c </w:t>
       </w:r>
       <w:r>
         <w:rPr>
@@ -19139,7 +19080,7 @@
           <w:rFonts w:ascii="Times New Roman" w:hAnsi="Times New Roman"/>
           <w:sz w:val="24"/>
         </w:rPr>
-        <w:t xml:space="preserve"> Student </w:t>
+        <w:t xml:space="preserve"> EnrollmentStudent </w:t>
       </w:r>
       <w:r>
         <w:rPr>
@@ -19242,7 +19183,7 @@
           <w:rFonts w:ascii="Times New Roman" w:hAnsi="Times New Roman"/>
           <w:sz w:val="24"/>
         </w:rPr>
-        <w:t xml:space="preserve">Student s </w:t>
+        <w:t xml:space="preserve">EnrollmentStudent s </w:t>
       </w:r>
       <w:r>
         <w:rPr>
@@ -19914,7 +19855,7 @@
           <w:rFonts w:ascii="Times New Roman" w:hAnsi="Times New Roman"/>
           <w:sz w:val="24"/>
         </w:rPr>
-        <w:t xml:space="preserve">Course c </w:t>
+        <w:t xml:space="preserve">EnrollmentCourse c </w:t>
       </w:r>
       <w:r>
         <w:rPr>
@@ -20500,7 +20441,7 @@
           <w:rFonts w:ascii="Times New Roman" w:hAnsi="Times New Roman"/>
           <w:sz w:val="24"/>
         </w:rPr>
-        <w:t xml:space="preserve">Student s </w:t>
+        <w:t xml:space="preserve">EnrollmentStudent s </w:t>
       </w:r>
       <w:r>
         <w:rPr>
@@ -21131,7 +21072,7 @@
           <w:rFonts w:ascii="Times New Roman" w:hAnsi="Times New Roman"/>
           <w:sz w:val="24"/>
         </w:rPr>
-        <w:t xml:space="preserve">"  Course Enrollment &amp; Grade Management System"</w:t>
+        <w:t xml:space="preserve">"  EnrollmentCourse Enrollment &amp; Grade Management System"</w:t>
       </w:r>
       <w:r>
         <w:rPr>
@@ -22825,7 +22766,7 @@
           <w:rFonts w:ascii="Times New Roman" w:hAnsi="Times New Roman"/>
           <w:sz w:val="24"/>
         </w:rPr>
-        <w:t xml:space="preserve">"Course code: "</w:t>
+        <w:t xml:space="preserve">"EnrollmentCourse code: "</w:t>
       </w:r>
       <w:r>
         <w:rPr>
@@ -22991,7 +22932,7 @@
           <w:rFonts w:ascii="Times New Roman" w:hAnsi="Times New Roman"/>
           <w:sz w:val="24"/>
         </w:rPr>
-        <w:t xml:space="preserve">"Course name: "</w:t>
+        <w:t xml:space="preserve">"EnrollmentCourse name: "</w:t>
       </w:r>
       <w:r>
         <w:rPr>
@@ -23970,7 +23911,7 @@
           <w:rFonts w:ascii="Times New Roman" w:hAnsi="Times New Roman"/>
           <w:sz w:val="24"/>
         </w:rPr>
-        <w:t xml:space="preserve">"Student name: "</w:t>
+        <w:t xml:space="preserve">"EnrollmentStudent name: "</w:t>
       </w:r>
       <w:r>
         <w:rPr>
@@ -24136,7 +24077,7 @@
           <w:rFonts w:ascii="Times New Roman" w:hAnsi="Times New Roman"/>
           <w:sz w:val="24"/>
         </w:rPr>
-        <w:t xml:space="preserve">"Student ID: "</w:t>
+        <w:t xml:space="preserve">"EnrollmentStudent ID: "</w:t>
       </w:r>
       <w:r>
         <w:rPr>
@@ -25343,7 +25284,7 @@
           <w:rFonts w:ascii="Times New Roman" w:hAnsi="Times New Roman"/>
           <w:sz w:val="24"/>
         </w:rPr>
-        <w:t xml:space="preserve">                        Student st </w:t>
+        <w:t xml:space="preserve">                        EnrollmentStudent st </w:t>
       </w:r>
       <w:r>
         <w:rPr>
@@ -25406,7 +25347,7 @@
           <w:rFonts w:ascii="Times New Roman" w:hAnsi="Times New Roman"/>
           <w:sz w:val="24"/>
         </w:rPr>
-        <w:t xml:space="preserve">                        Course co </w:t>
+        <w:t xml:space="preserve">                        EnrollmentCourse co </w:t>
       </w:r>
       <w:r>
         <w:rPr>
@@ -25613,7 +25554,7 @@
           <w:rFonts w:ascii="Times New Roman" w:hAnsi="Times New Roman"/>
           <w:sz w:val="24"/>
         </w:rPr>
-        <w:t xml:space="preserve">"Student ID not found."</w:t>
+        <w:t xml:space="preserve">"EnrollmentStudent ID not found."</w:t>
       </w:r>
       <w:r>
         <w:rPr>
@@ -25820,7 +25761,7 @@
           <w:rFonts w:ascii="Times New Roman" w:hAnsi="Times New Roman"/>
           <w:sz w:val="24"/>
         </w:rPr>
-        <w:t xml:space="preserve">"Course code not found."</w:t>
+        <w:t xml:space="preserve">"EnrollmentCourse code not found."</w:t>
       </w:r>
       <w:r>
         <w:rPr>
@@ -26900,7 +26841,7 @@
           <w:rFonts w:ascii="Times New Roman" w:hAnsi="Times New Roman"/>
           <w:sz w:val="24"/>
         </w:rPr>
-        <w:t xml:space="preserve">                        Student st </w:t>
+        <w:t xml:space="preserve">                        EnrollmentStudent st </w:t>
       </w:r>
       <w:r>
         <w:rPr>
@@ -26963,7 +26904,7 @@
           <w:rFonts w:ascii="Times New Roman" w:hAnsi="Times New Roman"/>
           <w:sz w:val="24"/>
         </w:rPr>
-        <w:t xml:space="preserve">                        Course co </w:t>
+        <w:t xml:space="preserve">                        EnrollmentCourse co </w:t>
       </w:r>
       <w:r>
         <w:rPr>
@@ -27170,7 +27111,7 @@
           <w:rFonts w:ascii="Times New Roman" w:hAnsi="Times New Roman"/>
           <w:sz w:val="24"/>
         </w:rPr>
-        <w:t xml:space="preserve">"Student ID not found."</w:t>
+        <w:t xml:space="preserve">"EnrollmentStudent ID not found."</w:t>
       </w:r>
       <w:r>
         <w:rPr>
@@ -27377,7 +27318,7 @@
           <w:rFonts w:ascii="Times New Roman" w:hAnsi="Times New Roman"/>
           <w:sz w:val="24"/>
         </w:rPr>
-        <w:t xml:space="preserve">"Course code not found."</w:t>
+        <w:t xml:space="preserve">"EnrollmentCourse code not found."</w:t>
       </w:r>
       <w:r>
         <w:rPr>
@@ -28077,7 +28018,7 @@
           <w:rFonts w:ascii="Times New Roman" w:hAnsi="Times New Roman"/>
           <w:sz w:val="24"/>
         </w:rPr>
-        <w:t xml:space="preserve">                        Student st </w:t>
+        <w:t xml:space="preserve">                        EnrollmentStudent st </w:t>
       </w:r>
       <w:r>
         <w:rPr>
@@ -28284,7 +28225,7 @@
           <w:rFonts w:ascii="Times New Roman" w:hAnsi="Times New Roman"/>
           <w:sz w:val="24"/>
         </w:rPr>
-        <w:t xml:space="preserve">"Student ID not found."</w:t>
+        <w:t xml:space="preserve">"EnrollmentStudent ID not found."</w:t>
       </w:r>
       <w:r>
         <w:rPr>
@@ -28953,7 +28894,7 @@
           <w:rFonts w:ascii="Times New Roman" w:hAnsi="Times New Roman"/>
           <w:sz w:val="24"/>
         </w:rPr>
-        <w:t xml:space="preserve">                                       Course</w:t>
+        <w:t xml:space="preserve">                                       EnrollmentCourse</w:t>
       </w:r>
       <w:r>
         <w:rPr>
@@ -29519,7 +29460,7 @@
           <w:iCs/>
           <w:sz w:val="24"/>
         </w:rPr>
-        <w:t xml:space="preserve">[INSERT: IntelliJ editor showing CourseManagement.java with the project panel on the left showing Student.java, Course.java, and CourseManagement.java]</w:t>
+        <w:t xml:space="preserve">[INSERT: IntelliJ editor showing EnrollmentSystem.java with the project panel on the left showing EnrollmentStudent.java, EnrollmentCourse.java, and EnrollmentSystem.java]</w:t>
       </w:r>
     </w:p>
     <w:bookmarkEnd w:id="38"/>
@@ -29591,7 +29532,7 @@
           <w:iCs/>
           <w:sz w:val="24"/>
         </w:rPr>
-        <w:t xml:space="preserve">Course added: CS1102 — Programming 1 (0/30 enrolled)</w:t>
+        <w:t xml:space="preserve">EnrollmentCourse added: CS1102 — Programming 1 (0/30 enrolled)</w:t>
       </w:r>
       <w:r>
         <w:rPr>
@@ -29633,7 +29574,7 @@
           <w:iCs/>
           <w:sz w:val="24"/>
         </w:rPr>
-        <w:t xml:space="preserve">Course added: MATH101 — Calculus (0/25 enrolled)</w:t>
+        <w:t xml:space="preserve">EnrollmentCourse added: MATH101 — Calculus (0/25 enrolled)</w:t>
       </w:r>
       <w:r>
         <w:rPr>
@@ -29675,7 +29616,7 @@
           <w:iCs/>
           <w:sz w:val="24"/>
         </w:rPr>
-        <w:t xml:space="preserve">Student added: Student[ID=1001, Name=Alice Smith, Courses=0]</w:t>
+        <w:t xml:space="preserve">EnrollmentStudent added: EnrollmentStudent[ID=1001, Name=Alice Smith, Courses=0]</w:t>
       </w:r>
       <w:r>
         <w:rPr>
@@ -29717,7 +29658,7 @@
           <w:iCs/>
           <w:sz w:val="24"/>
         </w:rPr>
-        <w:t xml:space="preserve">Student added: Student[ID=1002, Name=Bob Jones, Courses=0]</w:t>
+        <w:t xml:space="preserve">EnrollmentStudent added: EnrollmentStudent[ID=1002, Name=Bob Jones, Courses=0]</w:t>
       </w:r>
       <w:r>
         <w:rPr>

</xml_diff>